<commit_message>
UI: Add Web Push Notification (FCM) support (v1.6.3)
</commit_message>
<xml_diff>
--- a/セットアップガイド.docx
+++ b/セットアップガイド.docx
@@ -27,29 +27,13 @@
     </w:p>
     <w:p>
       <w:r>
-        <w:t>本アプリケーションは、地域の消防団等が災害時に現場の状況をリアルタイムで共有するためのシステムです。 **「プログラミングの知識が全くない方」**でも導入できるように、一つ一つの手順</w:t>
-      </w:r>
-      <w:proofErr w:type="gramStart"/>
-      <w:r>
-        <w:t>を</w:t>
-      </w:r>
-      <w:proofErr w:type="gramEnd"/>
-      <w:r>
-        <w:t>画像（イメージ）</w:t>
-      </w:r>
-      <w:proofErr w:type="gramStart"/>
-      <w:r>
-        <w:t>を</w:t>
-      </w:r>
-      <w:proofErr w:type="gramEnd"/>
-      <w:r>
-        <w:t>交えて順番に解説します。</w:t>
+        <w:t>本アプリケーションは、地域の消防団等が災害時に現場の状況をリアルタイムで共有するためのシステムです。 **「プログラミングの知識が全くない方」**でも導入できるように、一つ一つの手順を画像（イメージ）を交えて順番に解説します。</w:t>
       </w:r>
     </w:p>
     <w:p>
       <w:r>
         <w:pict w14:anchorId="38869A7C">
-          <v:rect id="_x0000_i1087" style="width:532.8pt;height:.75pt" o:hrpct="0" o:hralign="center" o:hrstd="t" o:hr="t" fillcolor="#a0a0a0" stroked="f">
+          <v:rect id="_x0000_i1025" style="width:532.8pt;height:.75pt" o:hrpct="0" o:hralign="center" o:hrstd="t" o:hr="t" fillcolor="#a0a0a0" stroked="f">
             <v:textbox inset="5.85pt,.7pt,5.85pt,.7pt"/>
           </v:rect>
         </w:pict>
@@ -96,7 +80,7 @@
     <w:p>
       <w:r>
         <w:pict w14:anchorId="1EE15310">
-          <v:rect id="_x0000_i1088" style="width:532.8pt;height:.75pt" o:hrpct="0" o:hralign="center" o:hrstd="t" o:hr="t" fillcolor="#a0a0a0" stroked="f">
+          <v:rect id="_x0000_i1026" style="width:532.8pt;height:.75pt" o:hrpct="0" o:hralign="center" o:hrstd="t" o:hr="t" fillcolor="#a0a0a0" stroked="f">
             <v:textbox inset="5.85pt,.7pt,5.85pt,.7pt"/>
           </v:rect>
         </w:pict>
@@ -187,7 +171,7 @@
     <w:p>
       <w:r>
         <w:pict w14:anchorId="453C5E09">
-          <v:rect id="_x0000_i1089" style="width:532.8pt;height:.75pt" o:hrpct="0" o:hralign="center" o:hrstd="t" o:hr="t" fillcolor="#a0a0a0" stroked="f">
+          <v:rect id="_x0000_i1027" style="width:532.8pt;height:.75pt" o:hrpct="0" o:hralign="center" o:hrstd="t" o:hr="t" fillcolor="#a0a0a0" stroked="f">
             <v:textbox inset="5.85pt,.7pt,5.85pt,.7pt"/>
           </v:rect>
         </w:pict>
@@ -433,15 +417,7 @@
       </w:r>
       <w:proofErr w:type="spellEnd"/>
       <w:r>
-        <w:t xml:space="preserve"> = { </w:t>
-      </w:r>
-      <w:proofErr w:type="gramStart"/>
-      <w:r>
-        <w:t>...</w:t>
-      </w:r>
-      <w:proofErr w:type="gramEnd"/>
-      <w:r>
-        <w:t xml:space="preserve"> } という</w:t>
+        <w:t xml:space="preserve"> = { ... } という</w:t>
       </w:r>
       <w:r>
         <w:rPr>
@@ -461,7 +437,7 @@
     <w:p>
       <w:r>
         <w:pict w14:anchorId="37F05537">
-          <v:rect id="_x0000_i1090" style="width:532.8pt;height:.75pt" o:hrpct="0" o:hralign="center" o:hrstd="t" o:hr="t" fillcolor="#a0a0a0" stroked="f">
+          <v:rect id="_x0000_i1028" style="width:532.8pt;height:.75pt" o:hrpct="0" o:hralign="center" o:hrstd="t" o:hr="t" fillcolor="#a0a0a0" stroked="f">
             <v:textbox inset="5.85pt,.7pt,5.85pt,.7pt"/>
           </v:rect>
         </w:pict>
@@ -562,7 +538,7 @@
     <w:p>
       <w:r>
         <w:pict w14:anchorId="1A01DF92">
-          <v:rect id="_x0000_i1091" style="width:532.8pt;height:.75pt" o:hrpct="0" o:hralign="center" o:hrstd="t" o:hr="t" fillcolor="#a0a0a0" stroked="f">
+          <v:rect id="_x0000_i1029" style="width:532.8pt;height:.75pt" o:hrpct="0" o:hralign="center" o:hrstd="t" o:hr="t" fillcolor="#a0a0a0" stroked="f">
             <v:textbox inset="5.85pt,.7pt,5.85pt,.7pt"/>
           </v:rect>
         </w:pict>
@@ -716,13 +692,52 @@
       </w:r>
       <w:proofErr w:type="spellEnd"/>
       <w:r>
-        <w:t>あなたのキー</w:t>
-      </w:r>
-      <w:proofErr w:type="gramStart"/>
-      <w:r>
-        <w:t>...</w:t>
-      </w:r>
-      <w:proofErr w:type="gramEnd"/>
+        <w:t>あなたのキー...",</w:t>
+      </w:r>
+    </w:p>
+    <w:p>
+      <w:r>
+        <w:t xml:space="preserve">  </w:t>
+      </w:r>
+      <w:proofErr w:type="spellStart"/>
+      <w:r>
+        <w:t>authDomain</w:t>
+      </w:r>
+      <w:proofErr w:type="spellEnd"/>
+      <w:r>
+        <w:t>: "あなたのプロジェクト.firebaseapp.com",</w:t>
+      </w:r>
+    </w:p>
+    <w:p>
+      <w:r>
+        <w:t xml:space="preserve">  </w:t>
+      </w:r>
+      <w:proofErr w:type="spellStart"/>
+      <w:r>
+        <w:t>projectId</w:t>
+      </w:r>
+      <w:proofErr w:type="spellEnd"/>
+      <w:r>
+        <w:t>: "あなたのプロジェクト",</w:t>
+      </w:r>
+    </w:p>
+    <w:p>
+      <w:r>
+        <w:t xml:space="preserve">  </w:t>
+      </w:r>
+      <w:proofErr w:type="spellStart"/>
+      <w:r>
+        <w:t>storageBucket</w:t>
+      </w:r>
+      <w:proofErr w:type="spellEnd"/>
+      <w:r>
+        <w:t>: "あなたのプロジェクト.</w:t>
+      </w:r>
+      <w:proofErr w:type="spellStart"/>
+      <w:r>
+        <w:t>firebasestorage.app</w:t>
+      </w:r>
+      <w:proofErr w:type="spellEnd"/>
       <w:r>
         <w:t>",</w:t>
       </w:r>
@@ -733,11 +748,11 @@
       </w:r>
       <w:proofErr w:type="spellStart"/>
       <w:r>
-        <w:t>authDomain</w:t>
+        <w:t>messagingSenderId</w:t>
       </w:r>
       <w:proofErr w:type="spellEnd"/>
       <w:r>
-        <w:t>: "あなたのプロジェクト.firebaseapp.com",</w:t>
+        <w:t>: "123456789",</w:t>
       </w:r>
     </w:p>
     <w:p>
@@ -746,74 +761,17 @@
       </w:r>
       <w:proofErr w:type="spellStart"/>
       <w:r>
-        <w:t>projectId</w:t>
+        <w:t>appId</w:t>
       </w:r>
       <w:proofErr w:type="spellEnd"/>
       <w:r>
-        <w:t>: "あなたのプロジェクト",</w:t>
-      </w:r>
-    </w:p>
-    <w:p>
-      <w:r>
-        <w:t xml:space="preserve">  </w:t>
-      </w:r>
-      <w:proofErr w:type="spellStart"/>
-      <w:r>
-        <w:t>storageBucket</w:t>
-      </w:r>
-      <w:proofErr w:type="spellEnd"/>
-      <w:r>
-        <w:t>: "あなたのプロジェクト.</w:t>
-      </w:r>
-      <w:proofErr w:type="spellStart"/>
-      <w:r>
-        <w:t>firebasestorage.app</w:t>
-      </w:r>
-      <w:proofErr w:type="spellEnd"/>
-      <w:r>
-        <w:t>",</w:t>
-      </w:r>
-    </w:p>
-    <w:p>
-      <w:r>
-        <w:t xml:space="preserve">  </w:t>
-      </w:r>
-      <w:proofErr w:type="spellStart"/>
-      <w:r>
-        <w:t>messagingSenderId</w:t>
-      </w:r>
-      <w:proofErr w:type="spellEnd"/>
-      <w:r>
-        <w:t>: "123456789",</w:t>
-      </w:r>
-    </w:p>
-    <w:p>
-      <w:r>
-        <w:t xml:space="preserve">  </w:t>
-      </w:r>
-      <w:proofErr w:type="spellStart"/>
-      <w:r>
-        <w:t>appId</w:t>
-      </w:r>
-      <w:proofErr w:type="spellEnd"/>
-      <w:r>
-        <w:t>: "</w:t>
-      </w:r>
-      <w:proofErr w:type="gramStart"/>
-      <w:r>
-        <w:t>1:123456789:web</w:t>
-      </w:r>
-      <w:proofErr w:type="gramEnd"/>
-      <w:r>
-        <w:t>:abcdefg"</w:t>
-      </w:r>
-    </w:p>
-    <w:p>
-      <w:proofErr w:type="gramStart"/>
+        <w:t>: "1:123456789:web:abcdefg"</w:t>
+      </w:r>
+    </w:p>
+    <w:p>
       <w:r>
         <w:t>};</w:t>
       </w:r>
-      <w:proofErr w:type="gramEnd"/>
     </w:p>
     <w:p>
       <w:pPr>
@@ -830,23 +788,7 @@
           <w:b/>
           <w:bCs/>
         </w:rPr>
-        <w:t>「Commit changes</w:t>
-      </w:r>
-      <w:proofErr w:type="gramStart"/>
-      <w:r>
-        <w:rPr>
-          <w:b/>
-          <w:bCs/>
-        </w:rPr>
-        <w:t>...</w:t>
-      </w:r>
-      <w:proofErr w:type="gramEnd"/>
-      <w:r>
-        <w:rPr>
-          <w:b/>
-          <w:bCs/>
-        </w:rPr>
-        <w:t>」</w:t>
+        <w:t>「Commit changes...」</w:t>
       </w:r>
       <w:r>
         <w:t> を2回押して保存します。</w:t>
@@ -855,7 +797,7 @@
     <w:p>
       <w:r>
         <w:pict w14:anchorId="54EAAD8B">
-          <v:rect id="_x0000_i1092" style="width:532.8pt;height:.75pt" o:hrpct="0" o:hralign="center" o:hrstd="t" o:hr="t" fillcolor="#a0a0a0" stroked="f">
+          <v:rect id="_x0000_i1030" style="width:532.8pt;height:.75pt" o:hrpct="0" o:hralign="center" o:hrstd="t" o:hr="t" fillcolor="#a0a0a0" stroked="f">
             <v:textbox inset="5.85pt,.7pt,5.85pt,.7pt"/>
           </v:rect>
         </w:pict>
@@ -1129,7 +1071,7 @@
     <w:p>
       <w:r>
         <w:pict w14:anchorId="4A108E9A">
-          <v:rect id="_x0000_i1093" style="width:532.8pt;height:.75pt" o:hrpct="0" o:hralign="center" o:hrstd="t" o:hr="t" fillcolor="#a0a0a0" stroked="f">
+          <v:rect id="_x0000_i1031" style="width:532.8pt;height:.75pt" o:hrpct="0" o:hralign="center" o:hrstd="t" o:hr="t" fillcolor="#a0a0a0" stroked="f">
             <v:textbox inset="5.85pt,.7pt,5.85pt,.7pt"/>
           </v:rect>
         </w:pict>
@@ -1228,7 +1170,7 @@
     <w:p>
       <w:r>
         <w:pict w14:anchorId="783B935E">
-          <v:rect id="_x0000_i1094" style="width:532.8pt;height:.75pt" o:hrpct="0" o:hralign="center" o:hrstd="t" o:hr="t" fillcolor="#a0a0a0" stroked="f">
+          <v:rect id="_x0000_i1032" style="width:532.8pt;height:.75pt" o:hrpct="0" o:hralign="center" o:hrstd="t" o:hr="t" fillcolor="#a0a0a0" stroked="f">
             <v:textbox inset="5.85pt,.7pt,5.85pt,.7pt"/>
           </v:rect>
         </w:pict>
@@ -6157,6 +6099,7 @@
   <w:style w:type="character" w:default="1" w:styleId="a0">
     <w:name w:val="Default Paragraph Font"/>
     <w:uiPriority w:val="1"/>
+    <w:semiHidden/>
     <w:unhideWhenUsed/>
   </w:style>
   <w:style w:type="table" w:default="1" w:styleId="a1">

</xml_diff>